<commit_message>
Publish v1.1.0 via OTA: bug fixes + version bump
APP_VERSION=1.1.0 (server) + kAppVersion 1.1.0 (app); new APK in public/.
Installed v1.0.0 apps now get the 'Update available' prompt and self-install
the bug-fixed build. Dashboard feature guide + doc generator added.
</commit_message>
<xml_diff>
--- a/SAPTHARA_Technical_Guide.docx
+++ b/SAPTHARA_Technical_Guide.docx
@@ -1310,6 +1310,50 @@
       </w:r>
       <w:r>
         <w:t xml:space="preserve">Added: real camera/gallery PHOTO capture in field reports (req f); DISTRICT connectivity endpoint + dashboard panel with delayed-delivery detection and delivery:delayed alerts (req e,g); MULTILINGUAL UI (English/Hindi/Assamese/Bengali) with a Settings language switcher (req h); and MULTI-HAZARD prediction — flood + congestion + roadblock (road-damage) hazard types alongside landslide, each surfaced on the dashboard's Multi-Hazard Risk card (req b). Flood + landslide models retrained on NER-specific real data.</w:t>
+      </w:r>
+    </w:p>
+    <w:p>
+      <w:pPr>
+        <w:pStyle w:val="Heading3"/>
+        <w:spacing w:after="70" w:before="160"/>
+      </w:pPr>
+      <w:r>
+        <w:rPr>
+          <w:b/>
+          <w:bCs/>
+          <w:color w:val="1D4ED8"/>
+        </w:rPr>
+        <w:t xml:space="preserve">Phase 13 — Field-usability + delivery</w:t>
+      </w:r>
+    </w:p>
+    <w:p>
+      <w:pPr>
+        <w:spacing w:after="60"/>
+      </w:pPr>
+      <w:r>
+        <w:rPr>
+          <w:b/>
+          <w:bCs/>
+        </w:rPr>
+        <w:t xml:space="preserve">Why: </w:t>
+      </w:r>
+      <w:r>
+        <w:t xml:space="preserve">Make it real-user ready + self-updating.</w:t>
+      </w:r>
+    </w:p>
+    <w:p>
+      <w:pPr>
+        <w:spacing w:after="120"/>
+      </w:pPr>
+      <w:r>
+        <w:rPr>
+          <w:b/>
+          <w:bCs/>
+        </w:rPr>
+        <w:t xml:space="preserve">How: </w:t>
+      </w:r>
+      <w:r>
+        <w:t xml:space="preserve">Self-service SIGN-UP with Driver/Field-Officer role selection (accounts stored in Postgres, bcrypt); From/To ROUTE PLANNER (pick origin + destination from NER places -&gt; safe route + distance on demand); IN-APP AUTO-UPDATE (backend /app/version + APK hosting -&gt; the app prompts 'Update available -&gt; UPDATE', no Play Store, no re-send); PLACE NAMES instead of raw lat/lng everywhere; and field-bug fixes: report location via place-picker + real GPS button, a real Android location-permission request, and real device battery. Whole project recovered onto the D: drive under git version control.</w:t>
       </w:r>
     </w:p>
     <w:p>

</xml_diff>